<commit_message>
docs: embed real live depot-service health screenshot (home.lab, 2026-07-23) into md + docx
- images/depot-service-health.png: VCF Ops Inventory > VCF Depot Service, Health 100% / Normal / No Alerts
- md step 6 now shows the image; docx has it embedded (1 drawing, 234KB png)

Co-Authored-By: Claude Opus 4.8 <noreply@anthropic.com>
</commit_message>
<xml_diff>
--- a/FLEET-DEPOT-CA-TRUST.docx
+++ b/FLEET-DEPOT-CA-TRUST.docx
@@ -2419,6 +2419,79 @@
       </w:r>
       <w:r>
         <w:t xml:space="preserve"> 為準。)</w:t>
+      </w:r>
+    </w:p>
+    <w:p>
+      <w:pPr>
+        <w:spacing w:after="60"/>
+      </w:pPr>
+    </w:p>
+    <w:p>
+      <w:pPr>
+        <w:pBdr>
+          <w:top w:val="single" w:color="CCCCCC" w:sz="4"/>
+          <w:bottom w:val="single" w:color="CCCCCC" w:sz="4"/>
+          <w:left w:val="single" w:color="CCCCCC" w:sz="4"/>
+          <w:right w:val="single" w:color="CCCCCC" w:sz="4"/>
+        </w:pBdr>
+        <w:spacing w:after="40" w:before="80"/>
+        <w:jc w:val="center"/>
+      </w:pPr>
+      <w:r>
+        <w:drawing>
+          <wp:inline distT="0" distB="0" distL="0" distR="0">
+            <wp:extent cx="5715000" cy="3448050"/>
+            <wp:effectExtent t="0" r="0" b="0" l="0"/>
+            <wp:docPr id="1" name="" descr="" title=""/>
+            <wp:cNvGraphicFramePr>
+              <a:graphicFrameLocks xmlns:a="http://schemas.openxmlformats.org/drawingml/2006/main" noChangeAspect="1"/>
+            </wp:cNvGraphicFramePr>
+            <a:graphic xmlns:a="http://schemas.openxmlformats.org/drawingml/2006/main">
+              <a:graphicData uri="http://schemas.openxmlformats.org/drawingml/2006/picture">
+                <pic:pic xmlns:pic="http://schemas.openxmlformats.org/drawingml/2006/picture">
+                  <pic:nvPicPr>
+                    <pic:cNvPr id="0" name="" descr=""/>
+                    <pic:cNvPicPr>
+                      <a:picLocks noChangeAspect="1" noChangeArrowheads="1"/>
+                    </pic:cNvPicPr>
+                  </pic:nvPicPr>
+                  <pic:blipFill>
+                    <a:blip r:embed="rId7" cstate="none"/>
+                    <a:srcRect/>
+                    <a:stretch>
+                      <a:fillRect/>
+                    </a:stretch>
+                  </pic:blipFill>
+                  <pic:spPr bwMode="auto">
+                    <a:xfrm>
+                      <a:off x="0" y="0"/>
+                      <a:ext cx="5715000" cy="3448050"/>
+                    </a:xfrm>
+                    <a:prstGeom prst="rect">
+                      <a:avLst/>
+                    </a:prstGeom>
+                  </pic:spPr>
+                </pic:pic>
+              </a:graphicData>
+            </a:graphic>
+          </wp:inline>
+        </w:drawing>
+      </w:r>
+    </w:p>
+    <w:p>
+      <w:pPr>
+        <w:spacing w:after="100"/>
+        <w:jc w:val="center"/>
+      </w:pPr>
+      <w:r>
+        <w:rPr>
+          <w:i/>
+          <w:iCs/>
+          <w:color w:val="666666"/>
+          <w:sz w:val="18"/>
+          <w:szCs w:val="18"/>
+        </w:rPr>
+        <w:t xml:space="preserve">現行 home.lab M02 實截:VCF Operations → Inventory → VCF Depot Service「depot-service」→ Summary,Badge Health 100% / Efficiency 100% / Risk 0% / 1 Normal / No Alerts found(2026-07-23 live capture)</w:t>
       </w:r>
     </w:p>
     <w:p>

</xml_diff>